<commit_message>
Enhance user registration and analytics tracking
- Added a new `first_touch` field to the `User` model to capture attribution data during signup.
- Updated the `UserRegister` schema to include `first_touch`, `event_id`, `fbp`, `fbc`, and `analytics_consent` for improved tracking.
- Modified the `register` endpoint in the `auth` router to utilize the new fields for sending analytics events upon user registration.
- Integrated `send_capi_event` calls in the `billing` router to track checkout events and enhance analytics reporting.
- Updated various services and components to ensure compatibility with the new tracking features.

This update aims to improve user attribution and enhance the analytics capabilities of the application.
</commit_message>
<xml_diff>
--- a/docs/marketing/MARKETING_PLAYBOOK.docx
+++ b/docs/marketing/MARKETING_PLAYBOOK.docx
@@ -88,7 +88,7 @@
         <w:t xml:space="preserve"> </w:t>
       </w:r>
       <w:r>
-        <w:t xml:space="preserve">1.0 ·</w:t>
+        <w:t xml:space="preserve">1.1 ·</w:t>
       </w:r>
       <w:r>
         <w:t xml:space="preserve"> </w:t>
@@ -104,7 +104,7 @@
         <w:t xml:space="preserve"> </w:t>
       </w:r>
       <w:r>
-        <w:t xml:space="preserve">June 2026 ·</w:t>
+        <w:t xml:space="preserve">September 2026 ·</w:t>
       </w:r>
       <w:r>
         <w:t xml:space="preserve"> </w:t>
@@ -181,13 +181,69 @@
           <w:b/>
           <w:bCs/>
         </w:rPr>
+        <w:t xml:space="preserve">Guarantee line:</w:t>
+      </w:r>
+      <w:r>
+        <w:t xml:space="preserve"> </w:t>
+      </w:r>
+      <w:r>
+        <w:t xml:space="preserve">Free verdict. No signup. No card.</w:t>
+      </w:r>
+    </w:p>
+    <w:p>
+      <w:pPr>
+        <w:pStyle w:val="Compact"/>
+        <w:numPr>
+          <w:ilvl w:val="0"/>
+          <w:numId w:val="1001"/>
+        </w:numPr>
+      </w:pPr>
+      <w:r>
+        <w:rPr>
+          <w:b/>
+          <w:bCs/>
+        </w:rPr>
+        <w:t xml:space="preserve">Sign-off:</w:t>
+      </w:r>
+      <w:r>
+        <w:t xml:space="preserve"> </w:t>
+      </w:r>
+      <w:r>
+        <w:t xml:space="preserve">Google Deal Gap IQ. Know what to offer.</w:t>
+      </w:r>
+    </w:p>
+    <w:p>
+      <w:pPr>
+        <w:pStyle w:val="Compact"/>
+        <w:numPr>
+          <w:ilvl w:val="0"/>
+          <w:numId w:val="1001"/>
+        </w:numPr>
+      </w:pPr>
+      <w:r>
+        <w:rPr>
+          <w:b/>
+          <w:bCs/>
+        </w:rPr>
         <w:t xml:space="preserve">Free tier:</w:t>
       </w:r>
       <w:r>
         <w:t xml:space="preserve"> </w:t>
       </w:r>
       <w:r>
-        <w:t xml:space="preserve">Free to start — no credit card required for entry analysis</w:t>
+        <w:t xml:space="preserve">First verdict free with no account. Free account: 2 analyses a month, 10 saved properties. Source:</w:t>
+      </w:r>
+      <w:r>
+        <w:t xml:space="preserve"> </w:t>
+      </w:r>
+      <w:r>
+        <w:rPr>
+          <w:rStyle w:val="VerbatimChar"/>
+        </w:rPr>
+        <w:t xml:space="preserve">frontend/src/lib/planFeatures.ts</w:t>
+      </w:r>
+      <w:r>
+        <w:t xml:space="preserve">.</w:t>
       </w:r>
     </w:p>
     <w:p>
@@ -203,13 +259,13 @@
           <w:b/>
           <w:bCs/>
         </w:rPr>
-        <w:t xml:space="preserve">Paid tiers:</w:t>
-      </w:r>
-      <w:r>
-        <w:t xml:space="preserve"> </w:t>
-      </w:r>
-      <w:r>
-        <w:t xml:space="preserve">TBD — confirm current pricing before publishing paid-tier copy</w:t>
+        <w:t xml:space="preserve">Pro:</w:t>
+      </w:r>
+      <w:r>
+        <w:t xml:space="preserve"> </w:t>
+      </w:r>
+      <w:r>
+        <w:t xml:space="preserve">$34.99/month or $349.99/year, 7-day trial. Directories and exports unlock with the first payment.</w:t>
       </w:r>
     </w:p>
     <w:p>
@@ -646,7 +702,7 @@
         </w:numPr>
       </w:pPr>
       <w:r>
-        <w:t xml:space="preserve">Lead with</w:t>
+        <w:t xml:space="preserve">Lead with the problem and the free verdict on acquisition surfaces (ads, landing pages).</w:t>
       </w:r>
       <w:r>
         <w:t xml:space="preserve"> </w:t>
@@ -662,7 +718,7 @@
         <w:t xml:space="preserve"> </w:t>
       </w:r>
       <w:r>
-        <w:t xml:space="preserve">on human-first surfaces (ads, hero, social).</w:t>
+        <w:t xml:space="preserve">is the product tagline for brand surfaces (App Store, hero, bios).</w:t>
       </w:r>
     </w:p>
     <w:p>
@@ -888,7 +944,19 @@
         <w:t xml:space="preserve"> </w:t>
       </w:r>
       <w:r>
-        <w:t xml:space="preserve">each. Web, iOS, and Android. Free to start.</w:t>
+        <w:t xml:space="preserve">each. Web, iOS, and Android. First verdict free — no signup, no card. A free</w:t>
+      </w:r>
+      <w:r>
+        <w:t xml:space="preserve"> </w:t>
+      </w:r>
+      <w:r>
+        <w:t xml:space="preserve">account adds 2 analyses a month and 10 saved properties. Pro is $34.99/month or</w:t>
+      </w:r>
+      <w:r>
+        <w:t xml:space="preserve"> </w:t>
+      </w:r>
+      <w:r>
+        <w:t xml:space="preserve">$349.99/year with a 7-day trial.</w:t>
       </w:r>
     </w:p>
     <w:bookmarkEnd w:id="12"/>
@@ -4436,18 +4504,18 @@
               <w:pStyle w:val="Compact"/>
             </w:pPr>
             <w:r>
-              <w:t xml:space="preserve">No credit card required</w:t>
-            </w:r>
-          </w:p>
-        </w:tc>
-        <w:tc>
-          <w:tcPr/>
-          <w:p>
-            <w:pPr>
-              <w:pStyle w:val="Compact"/>
-            </w:pPr>
-            <w:r>
-              <w:t xml:space="preserve">Free tier CTA</w:t>
+              <w:t xml:space="preserve">Free verdict. No signup. No card.</w:t>
+            </w:r>
+          </w:p>
+        </w:tc>
+        <w:tc>
+          <w:tcPr/>
+          <w:p>
+            <w:pPr>
+              <w:pStyle w:val="Compact"/>
+            </w:pPr>
+            <w:r>
+              <w:t xml:space="preserve">Guarantee line — under every primary CTA</w:t>
             </w:r>
           </w:p>
         </w:tc>
@@ -4460,18 +4528,18 @@
               <w:pStyle w:val="Compact"/>
             </w:pPr>
             <w:r>
-              <w:t xml:space="preserve">Free to start</w:t>
-            </w:r>
-          </w:p>
-        </w:tc>
-        <w:tc>
-          <w:tcPr/>
-          <w:p>
-            <w:pPr>
-              <w:pStyle w:val="Compact"/>
-            </w:pPr>
-            <w:r>
-              <w:t xml:space="preserve">Universal free tier</w:t>
+              <w:t xml:space="preserve">Google Deal Gap IQ. Know what to offer.</w:t>
+            </w:r>
+          </w:p>
+        </w:tc>
+        <w:tc>
+          <w:tcPr/>
+          <w:p>
+            <w:pPr>
+              <w:pStyle w:val="Compact"/>
+            </w:pPr>
+            <w:r>
+              <w:t xml:space="preserve">Sign-off — every public asset closer</w:t>
             </w:r>
           </w:p>
         </w:tc>
@@ -4484,6 +4552,126 @@
               <w:pStyle w:val="Compact"/>
             </w:pPr>
             <w:r>
+              <w:t xml:space="preserve">No credit card required</w:t>
+            </w:r>
+          </w:p>
+        </w:tc>
+        <w:tc>
+          <w:tcPr/>
+          <w:p>
+            <w:pPr>
+              <w:pStyle w:val="Compact"/>
+            </w:pPr>
+            <w:r>
+              <w:t xml:space="preserve">Free tier CTA</w:t>
+            </w:r>
+          </w:p>
+        </w:tc>
+      </w:tr>
+      <w:tr>
+        <w:tc>
+          <w:tcPr/>
+          <w:p>
+            <w:pPr>
+              <w:pStyle w:val="Compact"/>
+            </w:pPr>
+            <w:r>
+              <w:t xml:space="preserve">Free to start</w:t>
+            </w:r>
+          </w:p>
+        </w:tc>
+        <w:tc>
+          <w:tcPr/>
+          <w:p>
+            <w:pPr>
+              <w:pStyle w:val="Compact"/>
+            </w:pPr>
+            <w:r>
+              <w:t xml:space="preserve">Universal free tier</w:t>
+            </w:r>
+          </w:p>
+        </w:tc>
+      </w:tr>
+      <w:tr>
+        <w:tc>
+          <w:tcPr/>
+          <w:p>
+            <w:pPr>
+              <w:pStyle w:val="Compact"/>
+            </w:pPr>
+            <w:r>
+              <w:t xml:space="preserve">2 analyses a month, 10 saved properties</w:t>
+            </w:r>
+          </w:p>
+        </w:tc>
+        <w:tc>
+          <w:tcPr/>
+          <w:p>
+            <w:pPr>
+              <w:pStyle w:val="Compact"/>
+            </w:pPr>
+            <w:r>
+              <w:t xml:space="preserve">Free-account limits (from</w:t>
+            </w:r>
+            <w:r>
+              <w:t xml:space="preserve"> </w:t>
+            </w:r>
+            <w:r>
+              <w:rPr>
+                <w:rStyle w:val="VerbatimChar"/>
+              </w:rPr>
+              <w:t xml:space="preserve">planFeatures.ts</w:t>
+            </w:r>
+            <w:r>
+              <w:t xml:space="preserve">)</w:t>
+            </w:r>
+          </w:p>
+        </w:tc>
+      </w:tr>
+      <w:tr>
+        <w:tc>
+          <w:tcPr/>
+          <w:p>
+            <w:pPr>
+              <w:pStyle w:val="Compact"/>
+            </w:pPr>
+            <w:r>
+              <w:t xml:space="preserve">$34.99/month or $349.99/year · 7-day trial</w:t>
+            </w:r>
+          </w:p>
+        </w:tc>
+        <w:tc>
+          <w:tcPr/>
+          <w:p>
+            <w:pPr>
+              <w:pStyle w:val="Compact"/>
+            </w:pPr>
+            <w:r>
+              <w:t xml:space="preserve">Pro pricing (from</w:t>
+            </w:r>
+            <w:r>
+              <w:t xml:space="preserve"> </w:t>
+            </w:r>
+            <w:r>
+              <w:rPr>
+                <w:rStyle w:val="VerbatimChar"/>
+              </w:rPr>
+              <w:t xml:space="preserve">planFeatures.ts</w:t>
+            </w:r>
+            <w:r>
+              <w:t xml:space="preserve">)</w:t>
+            </w:r>
+          </w:p>
+        </w:tc>
+      </w:tr>
+      <w:tr>
+        <w:tc>
+          <w:tcPr/>
+          <w:p>
+            <w:pPr>
+              <w:pStyle w:val="Compact"/>
+            </w:pPr>
+            <w:r>
               <w:t xml:space="preserve">Cancel anytime in 2 clicks</w:t>
             </w:r>
           </w:p>
@@ -4495,7 +4683,7 @@
               <w:pStyle w:val="Compact"/>
             </w:pPr>
             <w:r>
-              <w:t xml:space="preserve">Paid tier risk reversal (when pricing is live)</w:t>
+              <w:t xml:space="preserve">Paid tier risk reversal</w:t>
             </w:r>
           </w:p>
         </w:tc>
@@ -10246,7 +10434,17 @@
               <w:pStyle w:val="Compact"/>
             </w:pPr>
             <w:r>
-              <w:t xml:space="preserve">Most conversion posts and ads</w:t>
+              <w:t xml:space="preserve">Most conversion posts and ads. Line under it:</w:t>
+            </w:r>
+            <w:r>
+              <w:t xml:space="preserve"> </w:t>
+            </w:r>
+            <w:r>
+              <w:rPr>
+                <w:i/>
+                <w:iCs/>
+              </w:rPr>
+              <w:t xml:space="preserve">Free verdict. No signup. No card.</w:t>
             </w:r>
           </w:p>
         </w:tc>
@@ -10364,6 +10562,45 @@
             </w:pPr>
             <w:r>
               <w:t xml:space="preserve">Top-of-funnel (when PDF is live)</w:t>
+            </w:r>
+          </w:p>
+        </w:tc>
+      </w:tr>
+      <w:tr>
+        <w:tc>
+          <w:tcPr/>
+          <w:p>
+            <w:pPr>
+              <w:pStyle w:val="Compact"/>
+            </w:pPr>
+            <w:r>
+              <w:rPr>
+                <w:b/>
+                <w:bCs/>
+              </w:rPr>
+              <w:t xml:space="preserve">Closer</w:t>
+            </w:r>
+          </w:p>
+        </w:tc>
+        <w:tc>
+          <w:tcPr/>
+          <w:p>
+            <w:pPr>
+              <w:pStyle w:val="Compact"/>
+            </w:pPr>
+            <w:r>
+              <w:t xml:space="preserve">Google Deal Gap IQ. Know what to offer.</w:t>
+            </w:r>
+          </w:p>
+        </w:tc>
+        <w:tc>
+          <w:tcPr/>
+          <w:p>
+            <w:pPr>
+              <w:pStyle w:val="Compact"/>
+            </w:pPr>
+            <w:r>
+              <w:t xml:space="preserve">Sign-off on every public asset</w:t>
             </w:r>
           </w:p>
         </w:tc>
@@ -10624,6 +10861,220 @@
       </w:r>
     </w:p>
     <w:p>
+      <w:pPr>
+        <w:pStyle w:val="FirstParagraph"/>
+      </w:pPr>
+      <w:r>
+        <w:rPr>
+          <w:b/>
+          <w:bCs/>
+        </w:rPr>
+        <w:t xml:space="preserve">Blog CTAs are tagged automatically</w:t>
+      </w:r>
+      <w:r>
+        <w:t xml:space="preserve"> </w:t>
+      </w:r>
+      <w:r>
+        <w:t xml:space="preserve">by</w:t>
+      </w:r>
+      <w:r>
+        <w:t xml:space="preserve"> </w:t>
+      </w:r>
+      <w:r>
+        <w:rPr>
+          <w:rStyle w:val="VerbatimChar"/>
+        </w:rPr>
+        <w:t xml:space="preserve">frontend/src/lib/blog-utm.ts</w:t>
+      </w:r>
+      <w:r>
+        <w:t xml:space="preserve"> </w:t>
+      </w:r>
+      <w:r>
+        <w:t xml:space="preserve">— never hand-write UTMs inside a post:</w:t>
+      </w:r>
+    </w:p>
+    <w:tbl>
+      <w:tblPr>
+        <w:tblStyle w:val="Table"/>
+        <w:tblW w:type="auto" w:w="0"/>
+        <w:tblLook w:firstRow="1" w:lastRow="0" w:firstColumn="0" w:lastColumn="0" w:noHBand="0" w:noVBand="0" w:val="0020"/>
+      </w:tblPr>
+      <w:tblGrid>
+        <w:gridCol w:w="3960"/>
+        <w:gridCol w:w="3960"/>
+      </w:tblGrid>
+      <w:tr>
+        <w:trPr>
+          <w:tblHeader w:val="on"/>
+        </w:trPr>
+        <w:tc>
+          <w:tcPr/>
+          <w:p>
+            <w:pPr>
+              <w:pStyle w:val="Compact"/>
+            </w:pPr>
+            <w:r>
+              <w:t xml:space="preserve">CTA location</w:t>
+            </w:r>
+          </w:p>
+        </w:tc>
+        <w:tc>
+          <w:tcPr/>
+          <w:p>
+            <w:pPr>
+              <w:pStyle w:val="Compact"/>
+            </w:pPr>
+            <w:r>
+              <w:t xml:space="preserve">UTM</w:t>
+            </w:r>
+          </w:p>
+        </w:tc>
+      </w:tr>
+      <w:tr>
+        <w:tc>
+          <w:tcPr/>
+          <w:p>
+            <w:pPr>
+              <w:pStyle w:val="Compact"/>
+            </w:pPr>
+            <w:r>
+              <w:t xml:space="preserve">End-of-post conversion block</w:t>
+            </w:r>
+          </w:p>
+        </w:tc>
+        <w:tc>
+          <w:tcPr/>
+          <w:p>
+            <w:pPr>
+              <w:pStyle w:val="Compact"/>
+            </w:pPr>
+            <w:r>
+              <w:rPr>
+                <w:rStyle w:val="VerbatimChar"/>
+              </w:rPr>
+              <w:t xml:space="preserve">utm_source=blog&amp;utm_medium=post&amp;utm_campaign={slug}</w:t>
+            </w:r>
+          </w:p>
+        </w:tc>
+      </w:tr>
+      <w:tr>
+        <w:tc>
+          <w:tcPr/>
+          <w:p>
+            <w:pPr>
+              <w:pStyle w:val="Compact"/>
+            </w:pPr>
+            <w:r>
+              <w:rPr>
+                <w:rStyle w:val="VerbatimChar"/>
+              </w:rPr>
+              <w:t xml:space="preserve">::cta</w:t>
+            </w:r>
+            <w:r>
+              <w:t xml:space="preserve"> </w:t>
+            </w:r>
+            <w:r>
+              <w:t xml:space="preserve">directive inside the body</w:t>
+            </w:r>
+          </w:p>
+        </w:tc>
+        <w:tc>
+          <w:tcPr/>
+          <w:p>
+            <w:pPr>
+              <w:pStyle w:val="Compact"/>
+            </w:pPr>
+            <w:r>
+              <w:rPr>
+                <w:rStyle w:val="VerbatimChar"/>
+              </w:rPr>
+              <w:t xml:space="preserve">utm_source=blog&amp;utm_medium=inline&amp;utm_campaign={slug}</w:t>
+            </w:r>
+          </w:p>
+        </w:tc>
+      </w:tr>
+      <w:tr>
+        <w:tc>
+          <w:tcPr/>
+          <w:p>
+            <w:pPr>
+              <w:pStyle w:val="Compact"/>
+            </w:pPr>
+            <w:r>
+              <w:t xml:space="preserve">Category / index pages</w:t>
+            </w:r>
+          </w:p>
+        </w:tc>
+        <w:tc>
+          <w:tcPr/>
+          <w:p>
+            <w:pPr>
+              <w:pStyle w:val="Compact"/>
+            </w:pPr>
+            <w:r>
+              <w:rPr>
+                <w:rStyle w:val="VerbatimChar"/>
+              </w:rPr>
+              <w:t xml:space="preserve">utm_source=blog&amp;utm_medium=category</w:t>
+            </w:r>
+            <w:r>
+              <w:t xml:space="preserve"> </w:t>
+            </w:r>
+            <w:r>
+              <w:t xml:space="preserve">or</w:t>
+            </w:r>
+            <w:r>
+              <w:t xml:space="preserve"> </w:t>
+            </w:r>
+            <w:r>
+              <w:rPr>
+                <w:rStyle w:val="VerbatimChar"/>
+              </w:rPr>
+              <w:t xml:space="preserve">index</w:t>
+            </w:r>
+          </w:p>
+        </w:tc>
+      </w:tr>
+    </w:tbl>
+    <w:p>
+      <w:pPr>
+        <w:pStyle w:val="BodyText"/>
+      </w:pPr>
+      <w:r>
+        <w:t xml:space="preserve">Clicks fire</w:t>
+      </w:r>
+      <w:r>
+        <w:t xml:space="preserve"> </w:t>
+      </w:r>
+      <w:r>
+        <w:rPr>
+          <w:rStyle w:val="VerbatimChar"/>
+        </w:rPr>
+        <w:t xml:space="preserve">blog_cta_clicked</w:t>
+      </w:r>
+      <w:r>
+        <w:t xml:space="preserve"> </w:t>
+      </w:r>
+      <w:r>
+        <w:t xml:space="preserve">(PostHog + Vercel) with the same</w:t>
+      </w:r>
+      <w:r>
+        <w:t xml:space="preserve"> </w:t>
+      </w:r>
+      <w:r>
+        <w:rPr>
+          <w:rStyle w:val="VerbatimChar"/>
+        </w:rPr>
+        <w:t xml:space="preserve">slug</w:t>
+      </w:r>
+      <w:r>
+        <w:t xml:space="preserve"> </w:t>
+      </w:r>
+      <w:r>
+        <w:t xml:space="preserve">so a verdict run can be traced back to the post that earned it.</w:t>
+      </w:r>
+    </w:p>
+    <w:p>
       <w:r>
         <w:pict>
           <v:rect style="width:0;height:1.5pt" o:hralign="center" o:hrstd="t" o:hr="t"/>
@@ -11043,7 +11494,16 @@
         </w:numPr>
       </w:pPr>
       <w:r>
-        <w:t xml:space="preserve">Specific Pro pricing until confirmed current (paid tiers TBD in this playbook)</w:t>
+        <w:t xml:space="preserve">A price, free-tier limit, or trial length that is not the live value in</w:t>
+      </w:r>
+      <w:r>
+        <w:t xml:space="preserve"> </w:t>
+      </w:r>
+      <w:r>
+        <w:rPr>
+          <w:rStyle w:val="VerbatimChar"/>
+        </w:rPr>
+        <w:t xml:space="preserve">frontend/src/lib/planFeatures.ts</w:t>
       </w:r>
     </w:p>
     <w:bookmarkEnd w:id="89"/>
@@ -11180,7 +11640,7 @@
         <w:rPr>
           <w:rStyle w:val="VerbatimChar"/>
         </w:rPr>
-        <w:t xml:space="preserve">PRODUCT TAGLINE     Hunt. Score. Close.</w:t>
+        <w:t xml:space="preserve">PRODUCT TAGLINE     Hunt. Score. Close. (brand surfaces)</w:t>
       </w:r>
       <w:r>
         <w:br/>
@@ -11189,6 +11649,33 @@
         <w:rPr>
           <w:rStyle w:val="VerbatimChar"/>
         </w:rPr>
+        <w:t xml:space="preserve">ACQUISITION LEAD    The problem + the free verdict</w:t>
+      </w:r>
+      <w:r>
+        <w:br/>
+      </w:r>
+      <w:r>
+        <w:rPr>
+          <w:rStyle w:val="VerbatimChar"/>
+        </w:rPr>
+        <w:t xml:space="preserve">GUARANTEE           Free verdict. No signup. No card.</w:t>
+      </w:r>
+      <w:r>
+        <w:br/>
+      </w:r>
+      <w:r>
+        <w:rPr>
+          <w:rStyle w:val="VerbatimChar"/>
+        </w:rPr>
+        <w:t xml:space="preserve">SIGN-OFF            Google Deal Gap IQ. Know what to offer.</w:t>
+      </w:r>
+      <w:r>
+        <w:br/>
+      </w:r>
+      <w:r>
+        <w:rPr>
+          <w:rStyle w:val="VerbatimChar"/>
+        </w:rPr>
         <w:t xml:space="preserve">MANIFESTO           The price tag isn't the deal. The structure is.</w:t>
       </w:r>
       <w:r>
@@ -11216,7 +11703,7 @@
         <w:rPr>
           <w:rStyle w:val="VerbatimChar"/>
         </w:rPr>
-        <w:t xml:space="preserve">FREE TIER           Free to start — no credit card for entry analysis</w:t>
+        <w:t xml:space="preserve">FREE TIER           First verdict free, no account. Free account: 2 analyses/mo, 10 saved</w:t>
       </w:r>
       <w:r>
         <w:br/>
@@ -11225,7 +11712,7 @@
         <w:rPr>
           <w:rStyle w:val="VerbatimChar"/>
         </w:rPr>
-        <w:t xml:space="preserve">PAID TIERS          TBD — confirm before publishing paid copy</w:t>
+        <w:t xml:space="preserve">PRO                 $34.99/mo or $349.99/yr, 7-day trial. Directories/exports after first payment.</w:t>
       </w:r>
       <w:r>
         <w:br/>
@@ -11373,7 +11860,7 @@
           <w:i/>
           <w:iCs/>
         </w:rPr>
-        <w:t xml:space="preserve">This playbook consolidates approved DealGapIQ marketing language as of June 2026.</w:t>
+        <w:t xml:space="preserve">This playbook consolidates approved DealGapIQ marketing language as of September 2026.</w:t>
       </w:r>
       <w:r>
         <w:rPr>
@@ -11387,7 +11874,7 @@
           <w:i/>
           <w:iCs/>
         </w:rPr>
-        <w:t xml:space="preserve">Confirm paid-tier pricing and free-tier analysis limits with the product owner</w:t>
+        <w:t xml:space="preserve">Prices, free-tier limits, and trial length must match</w:t>
       </w:r>
       <w:r>
         <w:rPr>
@@ -11398,10 +11885,32 @@
       </w:r>
       <w:r>
         <w:rPr>
+          <w:rStyle w:val="VerbatimChar"/>
           <w:i/>
           <w:iCs/>
         </w:rPr>
-        <w:t xml:space="preserve">before publishing conversion copy that states specific numbers.</w:t>
+        <w:t xml:space="preserve">frontend/src/lib/planFeatures.ts</w:t>
+      </w:r>
+      <w:r>
+        <w:rPr>
+          <w:i/>
+          <w:iCs/>
+        </w:rPr>
+        <w:t xml:space="preserve">.</w:t>
+      </w:r>
+      <w:r>
+        <w:rPr>
+          <w:i/>
+          <w:iCs/>
+        </w:rPr>
+        <w:t xml:space="preserve"> </w:t>
+      </w:r>
+      <w:r>
+        <w:rPr>
+          <w:i/>
+          <w:iCs/>
+        </w:rPr>
+        <w:t xml:space="preserve">Do not invent a number; render from that file.</w:t>
       </w:r>
     </w:p>
     <w:p>

</xml_diff>